<commit_message>
docs: add research plan draft
</commit_message>
<xml_diff>
--- a/docs/01-product-brief.docx
+++ b/docs/01-product-brief.docx
@@ -136,7 +136,7 @@
           <w:r>
             <w:fldChar w:fldCharType="separate"/>
           </w:r>
-          <w:hyperlink w:anchor="_Toc230012730" w:history="1">
+          <w:hyperlink w:anchor="_Toc230012955" w:history="1">
             <w:r>
               <w:rPr>
                 <w:rStyle w:val="Hyperlink"/>
@@ -163,7 +163,7 @@
                 <w:noProof/>
                 <w:webHidden/>
               </w:rPr>
-              <w:instrText xml:space="preserve"> PAGEREF _Toc230012730 \h </w:instrText>
+              <w:instrText xml:space="preserve"> PAGEREF _Toc230012955 \h </w:instrText>
             </w:r>
             <w:r>
               <w:rPr>
@@ -206,7 +206,7 @@
               <w:lang w:eastAsia="en-GB"/>
             </w:rPr>
           </w:pPr>
-          <w:hyperlink w:anchor="_Toc230012731" w:history="1">
+          <w:hyperlink w:anchor="_Toc230012956" w:history="1">
             <w:r>
               <w:rPr>
                 <w:rStyle w:val="Hyperlink"/>
@@ -233,7 +233,7 @@
                 <w:noProof/>
                 <w:webHidden/>
               </w:rPr>
-              <w:instrText xml:space="preserve"> PAGEREF _Toc230012731 \h </w:instrText>
+              <w:instrText xml:space="preserve"> PAGEREF _Toc230012956 \h </w:instrText>
             </w:r>
             <w:r>
               <w:rPr>
@@ -276,7 +276,7 @@
               <w:lang w:eastAsia="en-GB"/>
             </w:rPr>
           </w:pPr>
-          <w:hyperlink w:anchor="_Toc230012732" w:history="1">
+          <w:hyperlink w:anchor="_Toc230012957" w:history="1">
             <w:r>
               <w:rPr>
                 <w:rStyle w:val="Hyperlink"/>
@@ -303,7 +303,7 @@
                 <w:noProof/>
                 <w:webHidden/>
               </w:rPr>
-              <w:instrText xml:space="preserve"> PAGEREF _Toc230012732 \h </w:instrText>
+              <w:instrText xml:space="preserve"> PAGEREF _Toc230012957 \h </w:instrText>
             </w:r>
             <w:r>
               <w:rPr>
@@ -346,7 +346,7 @@
               <w:lang w:eastAsia="en-GB"/>
             </w:rPr>
           </w:pPr>
-          <w:hyperlink w:anchor="_Toc230012733" w:history="1">
+          <w:hyperlink w:anchor="_Toc230012958" w:history="1">
             <w:r>
               <w:rPr>
                 <w:rStyle w:val="Hyperlink"/>
@@ -373,7 +373,7 @@
                 <w:noProof/>
                 <w:webHidden/>
               </w:rPr>
-              <w:instrText xml:space="preserve"> PAGEREF _Toc230012733 \h </w:instrText>
+              <w:instrText xml:space="preserve"> PAGEREF _Toc230012958 \h </w:instrText>
             </w:r>
             <w:r>
               <w:rPr>
@@ -416,7 +416,7 @@
               <w:lang w:eastAsia="en-GB"/>
             </w:rPr>
           </w:pPr>
-          <w:hyperlink w:anchor="_Toc230012734" w:history="1">
+          <w:hyperlink w:anchor="_Toc230012959" w:history="1">
             <w:r>
               <w:rPr>
                 <w:rStyle w:val="Hyperlink"/>
@@ -443,7 +443,7 @@
                 <w:noProof/>
                 <w:webHidden/>
               </w:rPr>
-              <w:instrText xml:space="preserve"> PAGEREF _Toc230012734 \h </w:instrText>
+              <w:instrText xml:space="preserve"> PAGEREF _Toc230012959 \h </w:instrText>
             </w:r>
             <w:r>
               <w:rPr>
@@ -486,7 +486,7 @@
               <w:lang w:eastAsia="en-GB"/>
             </w:rPr>
           </w:pPr>
-          <w:hyperlink w:anchor="_Toc230012735" w:history="1">
+          <w:hyperlink w:anchor="_Toc230012960" w:history="1">
             <w:r>
               <w:rPr>
                 <w:rStyle w:val="Hyperlink"/>
@@ -513,7 +513,7 @@
                 <w:noProof/>
                 <w:webHidden/>
               </w:rPr>
-              <w:instrText xml:space="preserve"> PAGEREF _Toc230012735 \h </w:instrText>
+              <w:instrText xml:space="preserve"> PAGEREF _Toc230012960 \h </w:instrText>
             </w:r>
             <w:r>
               <w:rPr>
@@ -556,7 +556,7 @@
               <w:lang w:eastAsia="en-GB"/>
             </w:rPr>
           </w:pPr>
-          <w:hyperlink w:anchor="_Toc230012736" w:history="1">
+          <w:hyperlink w:anchor="_Toc230012961" w:history="1">
             <w:r>
               <w:rPr>
                 <w:rStyle w:val="Hyperlink"/>
@@ -583,7 +583,7 @@
                 <w:noProof/>
                 <w:webHidden/>
               </w:rPr>
-              <w:instrText xml:space="preserve"> PAGEREF _Toc230012736 \h </w:instrText>
+              <w:instrText xml:space="preserve"> PAGEREF _Toc230012961 \h </w:instrText>
             </w:r>
             <w:r>
               <w:rPr>
@@ -626,7 +626,7 @@
               <w:lang w:eastAsia="en-GB"/>
             </w:rPr>
           </w:pPr>
-          <w:hyperlink w:anchor="_Toc230012737" w:history="1">
+          <w:hyperlink w:anchor="_Toc230012962" w:history="1">
             <w:r>
               <w:rPr>
                 <w:rStyle w:val="Hyperlink"/>
@@ -653,7 +653,7 @@
                 <w:noProof/>
                 <w:webHidden/>
               </w:rPr>
-              <w:instrText xml:space="preserve"> PAGEREF _Toc230012737 \h </w:instrText>
+              <w:instrText xml:space="preserve"> PAGEREF _Toc230012962 \h </w:instrText>
             </w:r>
             <w:r>
               <w:rPr>
@@ -696,7 +696,7 @@
               <w:lang w:eastAsia="en-GB"/>
             </w:rPr>
           </w:pPr>
-          <w:hyperlink w:anchor="_Toc230012738" w:history="1">
+          <w:hyperlink w:anchor="_Toc230012963" w:history="1">
             <w:r>
               <w:rPr>
                 <w:rStyle w:val="Hyperlink"/>
@@ -723,7 +723,7 @@
                 <w:noProof/>
                 <w:webHidden/>
               </w:rPr>
-              <w:instrText xml:space="preserve"> PAGEREF _Toc230012738 \h </w:instrText>
+              <w:instrText xml:space="preserve"> PAGEREF _Toc230012963 \h </w:instrText>
             </w:r>
             <w:r>
               <w:rPr>
@@ -766,7 +766,7 @@
               <w:lang w:eastAsia="en-GB"/>
             </w:rPr>
           </w:pPr>
-          <w:hyperlink w:anchor="_Toc230012739" w:history="1">
+          <w:hyperlink w:anchor="_Toc230012964" w:history="1">
             <w:r>
               <w:rPr>
                 <w:rStyle w:val="Hyperlink"/>
@@ -793,7 +793,7 @@
                 <w:noProof/>
                 <w:webHidden/>
               </w:rPr>
-              <w:instrText xml:space="preserve"> PAGEREF _Toc230012739 \h </w:instrText>
+              <w:instrText xml:space="preserve"> PAGEREF _Toc230012964 \h </w:instrText>
             </w:r>
             <w:r>
               <w:rPr>
@@ -836,7 +836,7 @@
               <w:lang w:eastAsia="en-GB"/>
             </w:rPr>
           </w:pPr>
-          <w:hyperlink w:anchor="_Toc230012740" w:history="1">
+          <w:hyperlink w:anchor="_Toc230012965" w:history="1">
             <w:r>
               <w:rPr>
                 <w:rStyle w:val="Hyperlink"/>
@@ -863,7 +863,7 @@
                 <w:noProof/>
                 <w:webHidden/>
               </w:rPr>
-              <w:instrText xml:space="preserve"> PAGEREF _Toc230012740 \h </w:instrText>
+              <w:instrText xml:space="preserve"> PAGEREF _Toc230012965 \h </w:instrText>
             </w:r>
             <w:r>
               <w:rPr>
@@ -906,7 +906,7 @@
               <w:lang w:eastAsia="en-GB"/>
             </w:rPr>
           </w:pPr>
-          <w:hyperlink w:anchor="_Toc230012741" w:history="1">
+          <w:hyperlink w:anchor="_Toc230012966" w:history="1">
             <w:r>
               <w:rPr>
                 <w:rStyle w:val="Hyperlink"/>
@@ -933,7 +933,7 @@
                 <w:noProof/>
                 <w:webHidden/>
               </w:rPr>
-              <w:instrText xml:space="preserve"> PAGEREF _Toc230012741 \h </w:instrText>
+              <w:instrText xml:space="preserve"> PAGEREF _Toc230012966 \h </w:instrText>
             </w:r>
             <w:r>
               <w:rPr>
@@ -976,7 +976,7 @@
               <w:lang w:eastAsia="en-GB"/>
             </w:rPr>
           </w:pPr>
-          <w:hyperlink w:anchor="_Toc230012742" w:history="1">
+          <w:hyperlink w:anchor="_Toc230012967" w:history="1">
             <w:r>
               <w:rPr>
                 <w:rStyle w:val="Hyperlink"/>
@@ -1003,7 +1003,7 @@
                 <w:noProof/>
                 <w:webHidden/>
               </w:rPr>
-              <w:instrText xml:space="preserve"> PAGEREF _Toc230012742 \h </w:instrText>
+              <w:instrText xml:space="preserve"> PAGEREF _Toc230012967 \h </w:instrText>
             </w:r>
             <w:r>
               <w:rPr>
@@ -1046,7 +1046,7 @@
               <w:lang w:eastAsia="en-GB"/>
             </w:rPr>
           </w:pPr>
-          <w:hyperlink w:anchor="_Toc230012743" w:history="1">
+          <w:hyperlink w:anchor="_Toc230012968" w:history="1">
             <w:r>
               <w:rPr>
                 <w:rStyle w:val="Hyperlink"/>
@@ -1073,7 +1073,7 @@
                 <w:noProof/>
                 <w:webHidden/>
               </w:rPr>
-              <w:instrText xml:space="preserve"> PAGEREF _Toc230012743 \h </w:instrText>
+              <w:instrText xml:space="preserve"> PAGEREF _Toc230012968 \h </w:instrText>
             </w:r>
             <w:r>
               <w:rPr>
@@ -1124,7 +1124,7 @@
       <w:pPr>
         <w:pStyle w:val="Heading1"/>
       </w:pPr>
-      <w:bookmarkStart w:id="0" w:name="_Toc230012730"/>
+      <w:bookmarkStart w:id="0" w:name="_Toc230012955"/>
       <w:r>
         <w:t>1. Project Overview</w:t>
       </w:r>
@@ -1161,7 +1161,7 @@
       <w:pPr>
         <w:pStyle w:val="Heading1"/>
       </w:pPr>
-      <w:bookmarkStart w:id="1" w:name="_Toc230012731"/>
+      <w:bookmarkStart w:id="1" w:name="_Toc230012956"/>
       <w:r>
         <w:t>2. Problem Statement</w:t>
       </w:r>
@@ -1254,7 +1254,7 @@
       <w:pPr>
         <w:pStyle w:val="Heading1"/>
       </w:pPr>
-      <w:bookmarkStart w:id="2" w:name="_Toc230012732"/>
+      <w:bookmarkStart w:id="2" w:name="_Toc230012957"/>
       <w:r>
         <w:t>3. Product Aim</w:t>
       </w:r>
@@ -1337,7 +1337,7 @@
       <w:pPr>
         <w:pStyle w:val="Heading1"/>
       </w:pPr>
-      <w:bookmarkStart w:id="3" w:name="_Toc230012733"/>
+      <w:bookmarkStart w:id="3" w:name="_Toc230012958"/>
       <w:r>
         <w:lastRenderedPageBreak/>
         <w:t>4. Target Users</w:t>
@@ -1463,7 +1463,7 @@
       <w:pPr>
         <w:pStyle w:val="Heading1"/>
       </w:pPr>
-      <w:bookmarkStart w:id="4" w:name="_Toc230012734"/>
+      <w:bookmarkStart w:id="4" w:name="_Toc230012959"/>
       <w:r>
         <w:t>5. Core App Concept</w:t>
       </w:r>
@@ -1587,7 +1587,7 @@
       <w:pPr>
         <w:pStyle w:val="Heading1"/>
       </w:pPr>
-      <w:bookmarkStart w:id="5" w:name="_Toc230012735"/>
+      <w:bookmarkStart w:id="5" w:name="_Toc230012960"/>
       <w:r>
         <w:lastRenderedPageBreak/>
         <w:t>6. Minimum Viable Product Scope</w:t>
@@ -2135,7 +2135,7 @@
       <w:pPr>
         <w:pStyle w:val="Heading1"/>
       </w:pPr>
-      <w:bookmarkStart w:id="6" w:name="_Toc230012736"/>
+      <w:bookmarkStart w:id="6" w:name="_Toc230012961"/>
       <w:r>
         <w:t>7. Out of Scope for MVP</w:t>
       </w:r>
@@ -2268,7 +2268,7 @@
       <w:pPr>
         <w:pStyle w:val="Heading1"/>
       </w:pPr>
-      <w:bookmarkStart w:id="7" w:name="_Toc230012737"/>
+      <w:bookmarkStart w:id="7" w:name="_Toc230012962"/>
       <w:r>
         <w:t>8. Later Feature Ideas</w:t>
       </w:r>
@@ -2389,7 +2389,7 @@
       <w:pPr>
         <w:pStyle w:val="Heading1"/>
       </w:pPr>
-      <w:bookmarkStart w:id="8" w:name="_Toc230012738"/>
+      <w:bookmarkStart w:id="8" w:name="_Toc230012963"/>
       <w:r>
         <w:t>9. Business Model</w:t>
       </w:r>
@@ -2685,7 +2685,7 @@
       <w:pPr>
         <w:pStyle w:val="Heading1"/>
       </w:pPr>
-      <w:bookmarkStart w:id="9" w:name="_Toc230012739"/>
+      <w:bookmarkStart w:id="9" w:name="_Toc230012964"/>
       <w:r>
         <w:t>10. Responsible Design Considerations</w:t>
       </w:r>
@@ -2838,7 +2838,7 @@
       <w:pPr>
         <w:pStyle w:val="Heading1"/>
       </w:pPr>
-      <w:bookmarkStart w:id="10" w:name="_Toc230012740"/>
+      <w:bookmarkStart w:id="10" w:name="_Toc230012965"/>
       <w:r>
         <w:t>11. Key Assumptions</w:t>
       </w:r>
@@ -3123,7 +3123,7 @@
       <w:pPr>
         <w:pStyle w:val="Heading1"/>
       </w:pPr>
-      <w:bookmarkStart w:id="11" w:name="_Toc230012741"/>
+      <w:bookmarkStart w:id="11" w:name="_Toc230012966"/>
       <w:r>
         <w:t>12. Initial Risks</w:t>
       </w:r>
@@ -3525,7 +3525,7 @@
       <w:pPr>
         <w:pStyle w:val="Heading1"/>
       </w:pPr>
-      <w:bookmarkStart w:id="12" w:name="_Toc230012742"/>
+      <w:bookmarkStart w:id="12" w:name="_Toc230012967"/>
       <w:r>
         <w:t>13. Success Criteria</w:t>
       </w:r>
@@ -3809,7 +3809,7 @@
       <w:pPr>
         <w:pStyle w:val="Heading1"/>
       </w:pPr>
-      <w:bookmarkStart w:id="13" w:name="_Toc230012743"/>
+      <w:bookmarkStart w:id="13" w:name="_Toc230012968"/>
       <w:r>
         <w:t>14. Summary</w:t>
       </w:r>

</xml_diff>

<commit_message>
docs: Editor score review on 01-product brief and re-naming 02-research-plan to 02a-research plan
</commit_message>
<xml_diff>
--- a/docs/01-product-brief.docx
+++ b/docs/01-product-brief.docx
@@ -947,11 +947,9 @@
             <w:r>
               <w:t xml:space="preserve">Drink Awareness App is a planned iOS and Android application that helps adults aged 18+ track their alcohol consumption during social outings. By combining pub and bar discovery, drink logging, and AI-generated insights, the app addresses a gap that existing tools do not </w:t>
             </w:r>
-            <w:proofErr w:type="gramStart"/>
-            <w:r>
-              <w:t>fill:</w:t>
-            </w:r>
-            <w:proofErr w:type="gramEnd"/>
+            <w:r>
+              <w:t>fill,</w:t>
+            </w:r>
             <w:r>
               <w:t xml:space="preserve"> connecting real-world venue context with responsible personal awareness.</w:t>
             </w:r>
@@ -1124,12 +1122,25 @@
     </w:p>
     <w:p>
       <w:pPr>
+        <w:spacing w:after="120"/>
+        <w:jc w:val="both"/>
+      </w:pPr>
+    </w:p>
+    <w:p>
+      <w:pPr>
+        <w:spacing w:after="120"/>
+        <w:jc w:val="both"/>
+      </w:pPr>
+    </w:p>
+    <w:p>
+      <w:pPr>
         <w:pStyle w:val="Heading1"/>
         <w:pBdr>
           <w:bottom w:val="single" w:sz="4" w:space="4" w:color="2E6DA4"/>
         </w:pBdr>
       </w:pPr>
       <w:r>
+        <w:lastRenderedPageBreak/>
         <w:t>3.  Product Aim</w:t>
       </w:r>
     </w:p>
@@ -1139,7 +1150,6 @@
         <w:jc w:val="both"/>
       </w:pPr>
       <w:r>
-        <w:lastRenderedPageBreak/>
         <w:t>The aim of Drink Awareness App is to provide a mobile tool that helps adults track alcohol consumption, view drinking summaries, and receive personalised insights in a way that is simple, non-judgemental and suitable for everyday social use.</w:t>
       </w:r>
     </w:p>
@@ -1869,6 +1879,7 @@
                 <w:sz w:val="20"/>
                 <w:szCs w:val="20"/>
               </w:rPr>
+              <w:lastRenderedPageBreak/>
               <w:t>Awareness and Insight</w:t>
             </w:r>
           </w:p>
@@ -1914,7 +1925,6 @@
         <w:jc w:val="both"/>
       </w:pPr>
       <w:r>
-        <w:lastRenderedPageBreak/>
         <w:t>The app is designed to support awareness rather than judgement. The tone throughout should be helpful, balanced and encouraging.</w:t>
       </w:r>
     </w:p>
@@ -2972,6 +2982,7 @@
                 <w:sz w:val="20"/>
                 <w:szCs w:val="20"/>
               </w:rPr>
+              <w:lastRenderedPageBreak/>
               <w:t>Goal streaks</w:t>
             </w:r>
           </w:p>
@@ -3030,7 +3041,6 @@
                 <w:sz w:val="20"/>
                 <w:szCs w:val="20"/>
               </w:rPr>
-              <w:lastRenderedPageBreak/>
               <w:t>Advanced recommendation systems</w:t>
             </w:r>
           </w:p>
@@ -3404,15 +3414,13 @@
               </w:rPr>
               <w:t xml:space="preserve">Users could photograph a </w:t>
             </w:r>
-            <w:proofErr w:type="gramStart"/>
-            <w:r>
-              <w:rPr>
-                <w:sz w:val="20"/>
-                <w:szCs w:val="20"/>
-              </w:rPr>
-              <w:t>drink</w:t>
-            </w:r>
-            <w:proofErr w:type="gramEnd"/>
+            <w:r>
+              <w:rPr>
+                <w:sz w:val="20"/>
+                <w:szCs w:val="20"/>
+              </w:rPr>
+              <w:t>drink,</w:t>
+            </w:r>
             <w:r>
               <w:rPr>
                 <w:sz w:val="20"/>
@@ -3857,6 +3865,7 @@
                 <w:sz w:val="20"/>
                 <w:szCs w:val="20"/>
               </w:rPr>
+              <w:lastRenderedPageBreak/>
               <w:t>Premium (Subscription)</w:t>
             </w:r>
           </w:p>
@@ -3901,7 +3910,6 @@
         <w:pStyle w:val="Heading2"/>
       </w:pPr>
       <w:r>
-        <w:lastRenderedPageBreak/>
         <w:t>9.2  Future Revenue Opportunities</w:t>
       </w:r>
     </w:p>
@@ -4302,15 +4310,13 @@
               </w:rPr>
               <w:t xml:space="preserve">All </w:t>
             </w:r>
-            <w:proofErr w:type="gramStart"/>
-            <w:r>
-              <w:rPr>
-                <w:sz w:val="20"/>
-                <w:szCs w:val="20"/>
-              </w:rPr>
-              <w:t>copy,</w:t>
-            </w:r>
-            <w:proofErr w:type="gramEnd"/>
+            <w:r>
+              <w:rPr>
+                <w:sz w:val="20"/>
+                <w:szCs w:val="20"/>
+              </w:rPr>
+              <w:t>copy;</w:t>
+            </w:r>
             <w:r>
               <w:rPr>
                 <w:sz w:val="20"/>
@@ -4518,6 +4524,7 @@
         </w:pBdr>
       </w:pPr>
       <w:r>
+        <w:lastRenderedPageBreak/>
         <w:t>11. Key Assumptions</w:t>
       </w:r>
     </w:p>
@@ -5580,6 +5587,7 @@
                 <w:sz w:val="20"/>
                 <w:szCs w:val="20"/>
               </w:rPr>
+              <w:lastRenderedPageBreak/>
               <w:t>MVP scope expands beyond plan.</w:t>
             </w:r>
           </w:p>
@@ -5687,14 +5695,11 @@
         <w:jc w:val="both"/>
       </w:pPr>
       <w:r>
-        <w:lastRenderedPageBreak/>
         <w:t xml:space="preserve">The MVP can be considered complete when a user is able to do </w:t>
       </w:r>
-      <w:proofErr w:type="gramStart"/>
-      <w:r>
-        <w:t>all of</w:t>
-      </w:r>
-      <w:proofErr w:type="gramEnd"/>
+      <w:r>
+        <w:t>all</w:t>
+      </w:r>
       <w:r>
         <w:t xml:space="preserve"> the following without assistance:</w:t>
       </w:r>

</xml_diff>